<commit_message>
Sync cpfr-vc-mgrmicro: audit logging, archive, Starting_State snapshot
- Core files (streamlit_app.py, database_manager.py, vendor_processor.py)
  updated to single-row model with VC_CPFR_EMAIL_AUDIT logging
- Add_Logging/Starting_State/: versioned snapshot of final working files
- Archive/Dual_Entry_Version/: prior dual-entry implementation preserved
- .gitattributes: line-ending normalization from upstream merge
- CPFR_User_Stories-MVP.docx: local edits

Made-with: Cursor
</commit_message>
<xml_diff>
--- a/CPFR_VDS_CPH_Docs/TPM/CPFR_User_Stories-MVP.docx
+++ b/CPFR_VDS_CPH_Docs/TPM/CPFR_User_Stories-MVP.docx
@@ -333,144 +333,14 @@
       </w:r>
     </w:p>
     <w:p>
+      <w:commentRangeStart w:id="0"/>
+      <w:commentRangeStart w:id="1"/>
       <w:r>
         <w:rPr>
           <w:b/>
           <w:bCs/>
         </w:rPr>
         <w:t>Important context for engineering reviewers:</w:t>
-      </w:r>
-    </w:p>
-    <w:p>
-      <w:r>
-        <w:t>The CPFR data platform (Snowflake semantic layer, daily refresh, vendor isolation at the data layer) is delivered separately by SC-BIE and is on track for 3/31/2026. This document scopes only the CPH module that consumes that platform.</w:t>
-      </w:r>
-    </w:p>
-    <w:p>
-      <w:r>
-        <w:t>Email report distribution continues via the existing parallel CPFR report generator, pointed at the same Snowflake source. The CPH module does not replace or manage email delivery for MVP.</w:t>
-      </w:r>
-    </w:p>
-    <w:p>
-      <w:r>
-        <w:t>The BRD (CPH Portal &amp; Platform: Business Requirements, 2026-02-03) remains the canonical requirements reference. Stories here trace to BRD requirements where applicable.</w:t>
-      </w:r>
-    </w:p>
-    <w:p>
-      <w:r>
-        <w:t>Open technical questions are stated explicitly in §5. These are items we know we don’t yet know, and they are candidates for resolution during the spike itself or in pre-spike coordination.</w:t>
-      </w:r>
-    </w:p>
-    <w:p>
-      <w:r>
-        <w:rPr>
-          <w:b/>
-          <w:bCs/>
-        </w:rPr>
-        <w:t xml:space="preserve">Visual reference: </w:t>
-      </w:r>
-      <w:r>
-        <w:t>The CPFR in CPH Wireflow v2 illustrates the navigation structure, user-type fork, admin flows, scorecard layout, and data viewer.</w:t>
-      </w:r>
-    </w:p>
-    <w:p>
-      <w:pPr>
-        <w:pStyle w:val="Heading2"/>
-      </w:pPr>
-      <w:r>
-        <w:t>1. MVP Scope Boundary</w:t>
-      </w:r>
-    </w:p>
-    <w:p>
-      <w:pPr>
-        <w:pStyle w:val="Heading3"/>
-      </w:pPr>
-      <w:r>
-        <w:t>What MVP Delivers</w:t>
-      </w:r>
-    </w:p>
-    <w:p>
-      <w:r>
-        <w:t xml:space="preserve">Vendor partners can log into CPH, access </w:t>
-      </w:r>
-      <w:r>
-        <w:t>daily-refreshed</w:t>
-      </w:r>
-      <w:r>
-        <w:t xml:space="preserve"> CPFR data through a scorecard and grid view (one of two preset templates), manage their own personnel’s access to CPFR content, and retrieve historical reports by date. This removes vendor dependency on scheduled email reports and ISM intervention for data access and contact management.</w:t>
-      </w:r>
-    </w:p>
-    <w:p>
-      <w:pPr>
-        <w:pStyle w:val="Heading3"/>
-      </w:pPr>
-      <w:commentRangeStart w:id="0"/>
-      <w:r>
-        <w:t>What MVP Does Not Deliver</w:t>
-      </w:r>
-    </w:p>
-    <w:p>
-      <w:pPr>
-        <w:pStyle w:val="ListNumber"/>
-      </w:pPr>
-      <w:r>
-        <w:t>ISM/TM-facing views within CPH (ISMs access the same data via direct SSOT queries, Streamlit, or internal Tableau dashboards)</w:t>
-      </w:r>
-    </w:p>
-    <w:p>
-      <w:pPr>
-        <w:pStyle w:val="ListNumber"/>
-      </w:pPr>
-      <w:r>
-        <w:t>Chewy TM admin panel within CPH for template/report configuration (MVP uses the existing Snowflake tier-selection lookup table, manageable via Streamlit)</w:t>
-      </w:r>
-    </w:p>
-    <w:p>
-      <w:pPr>
-        <w:pStyle w:val="ListNumber"/>
-      </w:pPr>
-      <w:r>
-        <w:t>Cross-vendor aggregation or analytics views</w:t>
-      </w:r>
-    </w:p>
-    <w:p>
-      <w:pPr>
-        <w:pStyle w:val="ListNumber"/>
-      </w:pPr>
-      <w:r>
-        <w:t>ISM-customizable metric selection per vendor</w:t>
-      </w:r>
-    </w:p>
-    <w:p>
-      <w:pPr>
-        <w:pStyle w:val="ListNumber"/>
-      </w:pPr>
-      <w:r>
-        <w:t>Email delivery management through CPH</w:t>
-      </w:r>
-    </w:p>
-    <w:p>
-      <w:pPr>
-        <w:pStyle w:val="ListNumber"/>
-      </w:pPr>
-      <w:r>
-        <w:t>API access for vendors</w:t>
-      </w:r>
-    </w:p>
-    <w:p>
-      <w:pPr>
-        <w:pStyle w:val="ListNumber"/>
-      </w:pPr>
-      <w:r>
-        <w:t>Advanced analytics or ML-readiness features</w:t>
-      </w:r>
-    </w:p>
-    <w:p>
-      <w:pPr>
-        <w:pStyle w:val="ListNumber"/>
-      </w:pPr>
-      <w:r>
-        <w:t>VC/Chargeback module features (scoped separately by VC team)</w:t>
       </w:r>
       <w:commentRangeEnd w:id="0"/>
       <w:r>
@@ -481,14 +351,234 @@
         </w:rPr>
         <w:commentReference w:id="0"/>
       </w:r>
+      <w:commentRangeEnd w:id="1"/>
+      <w:r>
+        <w:rPr>
+          <w:rStyle w:val="CommentReference"/>
+          <w:sz w:val="20"/>
+          <w:szCs w:val="22"/>
+        </w:rPr>
+        <w:commentReference w:id="1"/>
+      </w:r>
+    </w:p>
+    <w:p>
+      <w:r>
+        <w:t>The CPFR data platform (Snowflake semantic layer, daily refresh, vendor isolation at the data layer) is delivered separately by SC-BIE and is on track for 3/31/2026. This document scopes only the CPH module that consumes that platform.</w:t>
+      </w:r>
+    </w:p>
+    <w:p>
+      <w:r>
+        <w:t>Email report distribution continues via the existing parallel CPFR report generator, pointed at the same Snowflake source. The CPH module does not replace or manage email delivery for MVP.</w:t>
+      </w:r>
+    </w:p>
+    <w:p>
+      <w:r>
+        <w:t>The BRD (CPH Portal &amp; Platform: Business Requirements, 2026-02-03) remains the canonical requirements reference. Stories here trace to BRD requirements where applicable.</w:t>
+      </w:r>
+    </w:p>
+    <w:p>
+      <w:r>
+        <w:t>Open technical questions are stated explicitly in §5. These are items we know we don’t yet know, and they are candidates for resolution during the spike itself or in pre-spike coordination.</w:t>
+      </w:r>
+    </w:p>
+    <w:p>
+      <w:r>
+        <w:rPr>
+          <w:b/>
+          <w:bCs/>
+        </w:rPr>
+        <w:t xml:space="preserve">Visual reference: </w:t>
+      </w:r>
+      <w:r>
+        <w:t>The CPFR in CPH Wireflow v2 illustrates the navigation structure, user-type fork, admin flows, scorecard layout, and data viewer.</w:t>
+      </w:r>
+    </w:p>
+    <w:p>
+      <w:pPr>
+        <w:pStyle w:val="Heading2"/>
+      </w:pPr>
+      <w:r>
+        <w:t>1. MVP Scope Boundary</w:t>
+      </w:r>
     </w:p>
     <w:p>
       <w:pPr>
         <w:pStyle w:val="Heading3"/>
       </w:pPr>
+      <w:commentRangeStart w:id="2"/>
+      <w:r>
+        <w:t>What MVP Delivers</w:t>
+      </w:r>
+      <w:commentRangeEnd w:id="2"/>
+      <w:r>
+        <w:rPr>
+          <w:rStyle w:val="CommentReference"/>
+          <w:sz w:val="24"/>
+          <w:szCs w:val="24"/>
+        </w:rPr>
+        <w:commentReference w:id="2"/>
+      </w:r>
+    </w:p>
+    <w:p>
+      <w:r>
+        <w:t xml:space="preserve">Vendor partners can log into CPH, access </w:t>
+      </w:r>
+      <w:r>
+        <w:t>daily-refreshed</w:t>
+      </w:r>
+      <w:r>
+        <w:t xml:space="preserve"> CPFR data through a scorecard and grid view (one of two preset templates), manage their own personnel’s access to CPFR content, and retrieve historical reports by date. This removes vendor dependency on scheduled email reports and ISM intervention for data access and contact management.</w:t>
+      </w:r>
+    </w:p>
+    <w:p/>
+    <w:p>
+      <w:r>
+        <w:rPr>
+          <w:noProof/>
+        </w:rPr>
+        <w:lastRenderedPageBreak/>
+        <w:drawing>
+          <wp:inline distT="0" distB="0" distL="0" distR="0" wp14:anchorId="2519CBFC" wp14:editId="34653724">
+            <wp:extent cx="6858000" cy="4574439"/>
+            <wp:effectExtent l="0" t="0" r="0" b="0"/>
+            <wp:docPr id="616423132" name="Picture 1"/>
+            <wp:cNvGraphicFramePr>
+              <a:graphicFrameLocks xmlns:a="http://schemas.openxmlformats.org/drawingml/2006/main" noChangeAspect="1"/>
+            </wp:cNvGraphicFramePr>
+            <a:graphic xmlns:a="http://schemas.openxmlformats.org/drawingml/2006/main">
+              <a:graphicData uri="http://schemas.openxmlformats.org/drawingml/2006/picture">
+                <pic:pic xmlns:pic="http://schemas.openxmlformats.org/drawingml/2006/picture">
+                  <pic:nvPicPr>
+                    <pic:cNvPr id="616423132" name="Picture 1"/>
+                    <pic:cNvPicPr/>
+                  </pic:nvPicPr>
+                  <pic:blipFill>
+                    <a:blip r:embed="rId12" cstate="print">
+                      <a:extLst>
+                        <a:ext uri="{28A0092B-C50C-407E-A947-70E740481C1C}">
+                          <a14:useLocalDpi xmlns:a14="http://schemas.microsoft.com/office/drawing/2010/main" val="0"/>
+                        </a:ext>
+                      </a:extLst>
+                    </a:blip>
+                    <a:stretch>
+                      <a:fillRect/>
+                    </a:stretch>
+                  </pic:blipFill>
+                  <pic:spPr>
+                    <a:xfrm>
+                      <a:off x="0" y="0"/>
+                      <a:ext cx="6858000" cy="4574439"/>
+                    </a:xfrm>
+                    <a:prstGeom prst="rect">
+                      <a:avLst/>
+                    </a:prstGeom>
+                  </pic:spPr>
+                </pic:pic>
+              </a:graphicData>
+            </a:graphic>
+          </wp:inline>
+        </w:drawing>
+      </w:r>
+    </w:p>
+    <w:p>
+      <w:pPr>
+        <w:pStyle w:val="Heading3"/>
+      </w:pPr>
+      <w:commentRangeStart w:id="3"/>
+      <w:r>
+        <w:t>What MVP Does Not Deliver</w:t>
+      </w:r>
+    </w:p>
+    <w:p>
+      <w:pPr>
+        <w:pStyle w:val="ListNumber"/>
+      </w:pPr>
+      <w:r>
+        <w:t>ISM/TM-facing views within CPH (ISMs access the same data via direct SSOT queries, Streamlit, or internal Tableau dashboards)</w:t>
+      </w:r>
+    </w:p>
+    <w:p>
+      <w:pPr>
+        <w:pStyle w:val="ListNumber"/>
+      </w:pPr>
+      <w:r>
+        <w:t>Chewy TM admin panel within CPH for template/report configuration (MVP uses the existing Snowflake tier-selection lookup table, manageable via Streamlit)</w:t>
+      </w:r>
+    </w:p>
+    <w:p>
+      <w:pPr>
+        <w:pStyle w:val="ListNumber"/>
+      </w:pPr>
+      <w:r>
+        <w:t>Cross-vendor aggregation or analytics views</w:t>
+      </w:r>
+    </w:p>
+    <w:p>
+      <w:pPr>
+        <w:pStyle w:val="ListNumber"/>
+      </w:pPr>
+      <w:r>
+        <w:t>ISM-customizable metric selection per vendor</w:t>
+      </w:r>
+    </w:p>
+    <w:p>
+      <w:pPr>
+        <w:pStyle w:val="ListNumber"/>
+      </w:pPr>
+      <w:r>
+        <w:t>Email delivery management through CPH</w:t>
+      </w:r>
+    </w:p>
+    <w:p>
+      <w:pPr>
+        <w:pStyle w:val="ListNumber"/>
+      </w:pPr>
+      <w:r>
+        <w:t>API access for vendors</w:t>
+      </w:r>
+    </w:p>
+    <w:p>
+      <w:pPr>
+        <w:pStyle w:val="ListNumber"/>
+      </w:pPr>
+      <w:r>
+        <w:t>Advanced analytics or ML-readiness features</w:t>
+      </w:r>
+    </w:p>
+    <w:p>
+      <w:pPr>
+        <w:pStyle w:val="ListNumber"/>
+      </w:pPr>
+      <w:r>
+        <w:t>VC/Chargeback module features (scoped separately by VC team)</w:t>
+      </w:r>
+      <w:commentRangeEnd w:id="3"/>
+      <w:r>
+        <w:rPr>
+          <w:rStyle w:val="CommentReference"/>
+          <w:sz w:val="20"/>
+          <w:szCs w:val="22"/>
+        </w:rPr>
+        <w:commentReference w:id="3"/>
+      </w:r>
+    </w:p>
+    <w:p>
+      <w:pPr>
+        <w:pStyle w:val="Heading3"/>
+      </w:pPr>
+      <w:commentRangeStart w:id="4"/>
       <w:r>
         <w:t>Design Constraint: Non-Fragmentation of Vendor Experience</w:t>
       </w:r>
+      <w:commentRangeEnd w:id="4"/>
+      <w:r>
+        <w:rPr>
+          <w:rStyle w:val="CommentReference"/>
+          <w:sz w:val="24"/>
+          <w:szCs w:val="24"/>
+        </w:rPr>
+        <w:commentReference w:id="4"/>
+      </w:r>
     </w:p>
     <w:p>
       <w:r>
@@ -499,8 +589,18 @@
       <w:pPr>
         <w:pStyle w:val="Heading2"/>
       </w:pPr>
+      <w:commentRangeStart w:id="5"/>
       <w:r>
         <w:t>2. MVP User Stories</w:t>
+      </w:r>
+      <w:commentRangeEnd w:id="5"/>
+      <w:r>
+        <w:rPr>
+          <w:rStyle w:val="CommentReference"/>
+          <w:sz w:val="26"/>
+          <w:szCs w:val="26"/>
+        </w:rPr>
+        <w:commentReference w:id="5"/>
       </w:r>
     </w:p>
     <w:p>
@@ -528,6 +628,7 @@
           <w:i/>
           <w:iCs/>
         </w:rPr>
+        <w:lastRenderedPageBreak/>
         <w:t>I want to access my CPFR data (scorecard and detailed metrics) on-demand, 24/7, through the Chewy Partner Hub,</w:t>
       </w:r>
     </w:p>
@@ -841,21 +942,21 @@
       <w:r>
         <w:t xml:space="preserve">Scorecard view presents metrics in a visual summary format </w:t>
       </w:r>
-      <w:commentRangeStart w:id="1"/>
+      <w:commentRangeStart w:id="6"/>
       <w:r>
         <w:rPr>
           <w:strike/>
         </w:rPr>
         <w:t>with drill-down to metric detail (per wireflow: Scorecard Home → Metric Detail fly-in with trailing averages).</w:t>
       </w:r>
-      <w:commentRangeEnd w:id="1"/>
+      <w:commentRangeEnd w:id="6"/>
       <w:r>
         <w:rPr>
           <w:rStyle w:val="CommentReference"/>
           <w:sz w:val="20"/>
           <w:szCs w:val="22"/>
         </w:rPr>
-        <w:commentReference w:id="1"/>
+        <w:commentReference w:id="6"/>
       </w:r>
     </w:p>
     <w:p>
@@ -879,6 +980,7 @@
           <w:iCs/>
           <w:color w:val="000000" w:themeColor="text1"/>
         </w:rPr>
+        <w:lastRenderedPageBreak/>
         <w:t>Specific metrics included in each template: [PINNED — pending CPFR team input.]</w:t>
       </w:r>
     </w:p>
@@ -1203,7 +1305,11 @@
         <w:pStyle w:val="Heading2"/>
       </w:pPr>
       <w:r>
-        <w:t>3. Success Metric</w:t>
+        <w:t xml:space="preserve">3. </w:t>
+      </w:r>
+      <w:commentRangeStart w:id="7"/>
+      <w:r>
+        <w:t>Success Metric</w:t>
       </w:r>
       <w:r>
         <w:t>s</w:t>
@@ -1211,23 +1317,33 @@
       <w:r>
         <w:t xml:space="preserve"> (Not for Engineering Estimation)</w:t>
       </w:r>
+      <w:commentRangeEnd w:id="7"/>
+      <w:r>
+        <w:rPr>
+          <w:rStyle w:val="CommentReference"/>
+          <w:sz w:val="26"/>
+          <w:szCs w:val="26"/>
+        </w:rPr>
+        <w:commentReference w:id="7"/>
+      </w:r>
     </w:p>
     <w:p>
       <w:pPr>
         <w:pStyle w:val="Heading3"/>
       </w:pPr>
-      <w:commentRangeStart w:id="2"/>
-      <w:r>
+      <w:commentRangeStart w:id="8"/>
+      <w:r>
+        <w:lastRenderedPageBreak/>
         <w:t>I-3: Reduction in Routine Data Work (Outcome Measure)</w:t>
       </w:r>
-      <w:commentRangeEnd w:id="2"/>
+      <w:commentRangeEnd w:id="8"/>
       <w:r>
         <w:rPr>
           <w:rStyle w:val="CommentReference"/>
           <w:sz w:val="24"/>
           <w:szCs w:val="24"/>
         </w:rPr>
-        <w:commentReference w:id="2"/>
+        <w:commentReference w:id="8"/>
       </w:r>
     </w:p>
     <w:p>
@@ -1251,18 +1367,31 @@
       <w:pPr>
         <w:pStyle w:val="Heading2"/>
       </w:pPr>
-      <w:commentRangeStart w:id="3"/>
-      <w:r>
-        <w:t>4. Stories Not in MVP CPH Scope</w:t>
-      </w:r>
-      <w:commentRangeEnd w:id="3"/>
+      <w:commentRangeStart w:id="9"/>
+      <w:r>
+        <w:t xml:space="preserve">4. </w:t>
+      </w:r>
+      <w:commentRangeStart w:id="10"/>
+      <w:r>
+        <w:t>Stories Not in MVP CPH Scope</w:t>
+      </w:r>
+      <w:commentRangeEnd w:id="9"/>
       <w:r>
         <w:rPr>
           <w:rStyle w:val="CommentReference"/>
           <w:sz w:val="26"/>
           <w:szCs w:val="26"/>
         </w:rPr>
-        <w:commentReference w:id="3"/>
+        <w:commentReference w:id="9"/>
+      </w:r>
+      <w:commentRangeEnd w:id="10"/>
+      <w:r>
+        <w:rPr>
+          <w:rStyle w:val="CommentReference"/>
+          <w:sz w:val="26"/>
+          <w:szCs w:val="26"/>
+        </w:rPr>
+        <w:commentReference w:id="10"/>
       </w:r>
     </w:p>
     <w:p>
@@ -1844,18 +1973,18 @@
       <w:pPr>
         <w:pStyle w:val="Heading3"/>
       </w:pPr>
-      <w:commentRangeStart w:id="4"/>
+      <w:commentRangeStart w:id="11"/>
       <w:r>
         <w:t>Phase 2 / Full-Scope (Preserved for Future Scoping)</w:t>
       </w:r>
-      <w:commentRangeEnd w:id="4"/>
+      <w:commentRangeEnd w:id="11"/>
       <w:r>
         <w:rPr>
           <w:rStyle w:val="CommentReference"/>
           <w:sz w:val="24"/>
           <w:szCs w:val="24"/>
         </w:rPr>
-        <w:commentReference w:id="4"/>
+        <w:commentReference w:id="11"/>
       </w:r>
     </w:p>
     <w:tbl>
@@ -2741,18 +2870,18 @@
       <w:pPr>
         <w:pStyle w:val="Heading2"/>
       </w:pPr>
-      <w:commentRangeStart w:id="5"/>
+      <w:commentRangeStart w:id="12"/>
       <w:r>
         <w:t>5. Open Technical Questions</w:t>
       </w:r>
-      <w:commentRangeEnd w:id="5"/>
+      <w:commentRangeEnd w:id="12"/>
       <w:r>
         <w:rPr>
           <w:rStyle w:val="CommentReference"/>
           <w:sz w:val="26"/>
           <w:szCs w:val="26"/>
         </w:rPr>
-        <w:commentReference w:id="5"/>
+        <w:commentReference w:id="12"/>
       </w:r>
     </w:p>
     <w:p>
@@ -2818,6 +2947,7 @@
                 <w:b/>
                 <w:bCs/>
               </w:rPr>
+              <w:lastRenderedPageBreak/>
               <w:t>#</w:t>
             </w:r>
           </w:p>
@@ -3599,18 +3729,18 @@
       <w:pPr>
         <w:pStyle w:val="Heading2"/>
       </w:pPr>
-      <w:commentRangeStart w:id="6"/>
+      <w:commentRangeStart w:id="13"/>
       <w:r>
         <w:t>6. Pinned Items (Awaiting Input)</w:t>
       </w:r>
-      <w:commentRangeEnd w:id="6"/>
+      <w:commentRangeEnd w:id="13"/>
       <w:r>
         <w:rPr>
           <w:rStyle w:val="CommentReference"/>
           <w:sz w:val="26"/>
           <w:szCs w:val="26"/>
         </w:rPr>
-        <w:commentReference w:id="6"/>
+        <w:commentReference w:id="13"/>
       </w:r>
     </w:p>
     <w:tbl>
@@ -4113,18 +4243,18 @@
             <w:pPr>
               <w:pStyle w:val="BodyText2"/>
             </w:pPr>
-            <w:commentRangeStart w:id="7"/>
+            <w:commentRangeStart w:id="14"/>
             <w:r>
               <w:t>CPFR in CPH Wireflow v2 (.png)</w:t>
             </w:r>
-            <w:commentRangeEnd w:id="7"/>
+            <w:commentRangeEnd w:id="14"/>
             <w:r>
               <w:rPr>
                 <w:rStyle w:val="CommentReference"/>
                 <w:sz w:val="20"/>
                 <w:szCs w:val="22"/>
               </w:rPr>
-              <w:commentReference w:id="7"/>
+              <w:commentReference w:id="14"/>
             </w:r>
           </w:p>
         </w:tc>
@@ -4272,7 +4402,7 @@
 
 <file path=word/comments.xml><?xml version="1.0" encoding="utf-8"?>
 <w:comments xmlns:wpc="http://schemas.microsoft.com/office/word/2010/wordprocessingCanvas" xmlns:cx="http://schemas.microsoft.com/office/drawing/2014/chartex" xmlns:cx1="http://schemas.microsoft.com/office/drawing/2015/9/8/chartex" xmlns:cx2="http://schemas.microsoft.com/office/drawing/2015/10/21/chartex" xmlns:cx3="http://schemas.microsoft.com/office/drawing/2016/5/9/chartex" xmlns:cx4="http://schemas.microsoft.com/office/drawing/2016/5/10/chartex" xmlns:cx5="http://schemas.microsoft.com/office/drawing/2016/5/11/chartex" xmlns:cx6="http://schemas.microsoft.com/office/drawing/2016/5/12/chartex" xmlns:cx7="http://schemas.microsoft.com/office/drawing/2016/5/13/chartex" xmlns:cx8="http://schemas.microsoft.com/office/drawing/2016/5/14/chartex" xmlns:mc="http://schemas.openxmlformats.org/markup-compatibility/2006" xmlns:aink="http://schemas.microsoft.com/office/drawing/2016/ink" xmlns:am3d="http://schemas.microsoft.com/office/drawing/2017/model3d" xmlns:o="urn:schemas-microsoft-com:office:office" xmlns:oel="http://schemas.microsoft.com/office/2019/extlst" xmlns:r="http://schemas.openxmlformats.org/officeDocument/2006/relationships" xmlns:m="http://schemas.openxmlformats.org/officeDocument/2006/math" xmlns:v="urn:schemas-microsoft-com:vml" xmlns:wp14="http://schemas.microsoft.com/office/word/2010/wordprocessingDrawing" xmlns:wp="http://schemas.openxmlformats.org/drawingml/2006/wordprocessingDrawing" xmlns:w10="urn:schemas-microsoft-com:office:word" xmlns:w="http://schemas.openxmlformats.org/wordprocessingml/2006/main" xmlns:w14="http://schemas.microsoft.com/office/word/2010/wordml" xmlns:w15="http://schemas.microsoft.com/office/word/2012/wordml" xmlns:w16cex="http://schemas.microsoft.com/office/word/2018/wordml/cex" xmlns:w16cid="http://schemas.microsoft.com/office/word/2016/wordml/cid" xmlns:w16="http://schemas.microsoft.com/office/word/2018/wordml" xmlns:w16du="http://schemas.microsoft.com/office/word/2023/wordml/word16du" xmlns:w16sdtdh="http://schemas.microsoft.com/office/word/2020/wordml/sdtdatahash" xmlns:w16sdtfl="http://schemas.microsoft.com/office/word/2024/wordml/sdtformatlock" xmlns:w16se="http://schemas.microsoft.com/office/word/2015/wordml/symex" xmlns:wpg="http://schemas.microsoft.com/office/word/2010/wordprocessingGroup" xmlns:wpi="http://schemas.microsoft.com/office/word/2010/wordprocessingInk" xmlns:wne="http://schemas.microsoft.com/office/word/2006/wordml" xmlns:wps="http://schemas.microsoft.com/office/word/2010/wordprocessingShape" mc:Ignorable="w14 w15 w16se w16cid w16 w16cex w16sdtdh w16sdtfl w16du wp14">
-  <w:comment w:id="0" w:author="Phanindher Patlola" w:date="2026-03-25T11:54:00Z" w:initials="PP">
+  <w:comment w:id="0" w:author="Phanindher Patlola" w:date="2026-03-26T11:26:00Z" w:initials="PP">
     <w:p>
       <w:pPr>
         <w:pStyle w:val="CommentText"/>
@@ -4284,11 +4414,19 @@
         <w:annotationRef/>
       </w:r>
       <w:r>
-        <w:t>I need a version of final product requirements as well (for CPFR only). Feels like this can be adjusted and made clear?</w:t>
+        <w:t>This section feels quite light and could use more detail. It would be helpful to clearly describe what the final end-state product for CPFR in CPH is expected to look like before moving straight into the MVP discussion.</w:t>
+      </w:r>
+    </w:p>
+    <w:p>
+      <w:pPr>
+        <w:pStyle w:val="CommentText"/>
+      </w:pPr>
+      <w:r>
+        <w:t>There’s also a reference to a BRD, but it’s not clear where that can be found or how to access it. Additionally, I’m not clear on what “CPH Wireflow V2” refers to?</w:t>
       </w:r>
     </w:p>
   </w:comment>
-  <w:comment w:id="1" w:author="Nathan Miles" w:date="2026-03-25T03:06:00Z" w:initials="NM">
+  <w:comment w:id="1" w:author="Nathan Miles" w:date="2026-03-26T13:23:00Z" w:initials="NM">
     <w:p>
       <w:r>
         <w:rPr>
@@ -4300,12 +4438,95 @@
         <w:rPr>
           <w:szCs w:val="20"/>
         </w:rPr>
+        <w:t>Added revised CPFR-only wireflow. Following discussion with Stefan today 3/26, page-level wireframes will be straightforward to produce by EOW.</w:t>
+      </w:r>
+    </w:p>
+  </w:comment>
+  <w:comment w:id="2" w:author="Phanindher Patlola" w:date="2026-03-26T11:30:00Z" w:initials="PP">
+    <w:p>
+      <w:pPr>
+        <w:pStyle w:val="CommentText"/>
+      </w:pPr>
+      <w:r>
+        <w:rPr>
+          <w:rStyle w:val="CommentReference"/>
+        </w:rPr>
+        <w:annotationRef/>
+      </w:r>
+      <w:r>
+        <w:t xml:space="preserve">We need a clearer explanation of what the MVP looks like. If there’s a visual available, we should include it to make this more concrete. It would also help to clearly outline the benefits of the MVP so it’s obvious why we’re prioritizing it. </w:t>
+      </w:r>
+    </w:p>
+  </w:comment>
+  <w:comment w:id="3" w:author="Phanindher Patlola" w:date="2026-03-25T11:54:00Z" w:initials="PP">
+    <w:p>
+      <w:pPr>
+        <w:pStyle w:val="CommentText"/>
+      </w:pPr>
+      <w:r>
+        <w:rPr>
+          <w:rStyle w:val="CommentReference"/>
+        </w:rPr>
+        <w:annotationRef/>
+      </w:r>
+      <w:r>
+        <w:t>We mention that this document is focused on CPFR integration into CPH, but it’s not clear why VC/chargebacks are included here?</w:t>
+      </w:r>
+    </w:p>
+  </w:comment>
+  <w:comment w:id="4" w:author="Phanindher Patlola" w:date="2026-03-26T11:30:00Z" w:initials="PP">
+    <w:p>
+      <w:pPr>
+        <w:pStyle w:val="CommentText"/>
+      </w:pPr>
+      <w:r>
+        <w:rPr>
+          <w:rStyle w:val="CommentReference"/>
+        </w:rPr>
+        <w:annotationRef/>
+      </w:r>
+      <w:r>
+        <w:t>Not sure why we need to state this?</w:t>
+      </w:r>
+    </w:p>
+  </w:comment>
+  <w:comment w:id="5" w:author="Phanindher Patlola" w:date="2026-03-26T11:30:00Z" w:initials="PP">
+    <w:p>
+      <w:pPr>
+        <w:pStyle w:val="CommentText"/>
+      </w:pPr>
+      <w:r>
+        <w:rPr>
+          <w:rStyle w:val="CommentReference"/>
+        </w:rPr>
+        <w:annotationRef/>
+      </w:r>
+      <w:r>
+        <w:t>This section should be for Tech team to estimate LOE</w:t>
+      </w:r>
+    </w:p>
+  </w:comment>
+  <w:comment w:id="6" w:author="Nathan Miles" w:date="2026-03-25T03:06:00Z" w:initials="NM">
+    <w:p>
+      <w:r>
+        <w:rPr>
+          <w:rStyle w:val="CommentReference"/>
+        </w:rPr>
+        <w:annotationRef/>
+      </w:r>
+      <w:r>
+        <w:rPr>
+          <w:szCs w:val="20"/>
+        </w:rPr>
         <w:t>This was a tie-in to the wireflow that was intended to exploit built-in patterns in CPH. The fly-in panel function can be eliminated to reduce complexity with very little net-loss of function. I'll update wireflow to reflect this and remove this from the user story.</w:t>
       </w:r>
     </w:p>
   </w:comment>
-  <w:comment w:id="2" w:author="Nathan Miles" w:date="2026-03-25T03:11:00Z" w:initials="NM">
-    <w:p>
+  <w:comment w:id="7" w:author="Phanindher Patlola" w:date="2026-03-26T11:32:00Z" w:initials="PP">
+    <w:p>
+      <w:pPr>
+        <w:pStyle w:val="CommentText"/>
+      </w:pPr>
       <w:r>
         <w:rPr>
           <w:rStyle w:val="CommentReference"/>
@@ -4313,6 +4534,19 @@
         <w:annotationRef/>
       </w:r>
       <w:r>
+        <w:t>This should be introduced earlier in the document, before the user stories section, so the context is clear upfront. I’m not sure this needs its own section given it’s only a few lines. It may be better to fold this into another relevant section for better flow.</w:t>
+      </w:r>
+    </w:p>
+  </w:comment>
+  <w:comment w:id="8" w:author="Nathan Miles" w:date="2026-03-25T03:11:00Z" w:initials="NM">
+    <w:p>
+      <w:r>
+        <w:rPr>
+          <w:rStyle w:val="CommentReference"/>
+        </w:rPr>
+        <w:annotationRef/>
+      </w:r>
+      <w:r>
         <w:rPr>
           <w:szCs w:val="20"/>
         </w:rPr>
@@ -4320,7 +4554,7 @@
       </w:r>
     </w:p>
   </w:comment>
-  <w:comment w:id="3" w:author="Nathan Miles" w:date="2026-03-25T03:11:00Z" w:initials="NM">
+  <w:comment w:id="9" w:author="Nathan Miles" w:date="2026-03-25T03:11:00Z" w:initials="NM">
     <w:p>
       <w:r>
         <w:rPr>
@@ -4336,8 +4570,11 @@
       </w:r>
     </w:p>
   </w:comment>
-  <w:comment w:id="4" w:author="Nathan Miles" w:date="2026-03-25T03:12:00Z" w:initials="NM">
-    <w:p>
+  <w:comment w:id="10" w:author="Phanindher Patlola" w:date="2026-03-26T11:32:00Z" w:initials="PP">
+    <w:p>
+      <w:pPr>
+        <w:pStyle w:val="CommentText"/>
+      </w:pPr>
       <w:r>
         <w:rPr>
           <w:rStyle w:val="CommentReference"/>
@@ -4345,6 +4582,19 @@
         <w:annotationRef/>
       </w:r>
       <w:r>
+        <w:t xml:space="preserve">This would be better placed in the appendix. It’s also not clear what the intent of this section is. Is it meant for the tech team or just for general awareness. As written, it feels a bit random and is difficult to follow. </w:t>
+      </w:r>
+    </w:p>
+  </w:comment>
+  <w:comment w:id="11" w:author="Nathan Miles" w:date="2026-03-25T03:12:00Z" w:initials="NM">
+    <w:p>
+      <w:r>
+        <w:rPr>
+          <w:rStyle w:val="CommentReference"/>
+        </w:rPr>
+        <w:annotationRef/>
+      </w:r>
+      <w:r>
         <w:rPr>
           <w:szCs w:val="20"/>
         </w:rPr>
@@ -4352,7 +4602,7 @@
       </w:r>
     </w:p>
   </w:comment>
-  <w:comment w:id="5" w:author="Nathan Miles" w:date="2026-03-25T03:13:00Z" w:initials="NM">
+  <w:comment w:id="12" w:author="Nathan Miles" w:date="2026-03-25T03:13:00Z" w:initials="NM">
     <w:p>
       <w:r>
         <w:rPr>
@@ -4368,7 +4618,7 @@
       </w:r>
     </w:p>
   </w:comment>
-  <w:comment w:id="6" w:author="Nathan Miles" w:date="2026-03-25T03:14:00Z" w:initials="NM">
+  <w:comment w:id="13" w:author="Nathan Miles" w:date="2026-03-25T03:14:00Z" w:initials="NM">
     <w:p>
       <w:r>
         <w:rPr>
@@ -4384,7 +4634,7 @@
       </w:r>
     </w:p>
   </w:comment>
-  <w:comment w:id="7" w:author="Nathan Miles" w:date="2026-03-25T03:15:00Z" w:initials="NM">
+  <w:comment w:id="14" w:author="Nathan Miles" w:date="2026-03-25T03:15:00Z" w:initials="NM">
     <w:p>
       <w:r>
         <w:rPr>
@@ -4405,10 +4655,17 @@
 
 <file path=word/commentsExtended.xml><?xml version="1.0" encoding="utf-8"?>
 <w15:commentsEx xmlns:wpc="http://schemas.microsoft.com/office/word/2010/wordprocessingCanvas" xmlns:cx="http://schemas.microsoft.com/office/drawing/2014/chartex" xmlns:cx1="http://schemas.microsoft.com/office/drawing/2015/9/8/chartex" xmlns:cx2="http://schemas.microsoft.com/office/drawing/2015/10/21/chartex" xmlns:cx3="http://schemas.microsoft.com/office/drawing/2016/5/9/chartex" xmlns:cx4="http://schemas.microsoft.com/office/drawing/2016/5/10/chartex" xmlns:cx5="http://schemas.microsoft.com/office/drawing/2016/5/11/chartex" xmlns:cx6="http://schemas.microsoft.com/office/drawing/2016/5/12/chartex" xmlns:cx7="http://schemas.microsoft.com/office/drawing/2016/5/13/chartex" xmlns:cx8="http://schemas.microsoft.com/office/drawing/2016/5/14/chartex" xmlns:mc="http://schemas.openxmlformats.org/markup-compatibility/2006" xmlns:aink="http://schemas.microsoft.com/office/drawing/2016/ink" xmlns:am3d="http://schemas.microsoft.com/office/drawing/2017/model3d" xmlns:o="urn:schemas-microsoft-com:office:office" xmlns:oel="http://schemas.microsoft.com/office/2019/extlst" xmlns:r="http://schemas.openxmlformats.org/officeDocument/2006/relationships" xmlns:m="http://schemas.openxmlformats.org/officeDocument/2006/math" xmlns:v="urn:schemas-microsoft-com:vml" xmlns:wp14="http://schemas.microsoft.com/office/word/2010/wordprocessingDrawing" xmlns:wp="http://schemas.openxmlformats.org/drawingml/2006/wordprocessingDrawing" xmlns:w10="urn:schemas-microsoft-com:office:word" xmlns:w="http://schemas.openxmlformats.org/wordprocessingml/2006/main" xmlns:w14="http://schemas.microsoft.com/office/word/2010/wordml" xmlns:w15="http://schemas.microsoft.com/office/word/2012/wordml" xmlns:w16cex="http://schemas.microsoft.com/office/word/2018/wordml/cex" xmlns:w16cid="http://schemas.microsoft.com/office/word/2016/wordml/cid" xmlns:w16="http://schemas.microsoft.com/office/word/2018/wordml" xmlns:w16du="http://schemas.microsoft.com/office/word/2023/wordml/word16du" xmlns:w16sdtdh="http://schemas.microsoft.com/office/word/2020/wordml/sdtdatahash" xmlns:w16sdtfl="http://schemas.microsoft.com/office/word/2024/wordml/sdtformatlock" xmlns:w16se="http://schemas.microsoft.com/office/word/2015/wordml/symex" xmlns:wpg="http://schemas.microsoft.com/office/word/2010/wordprocessingGroup" xmlns:wpi="http://schemas.microsoft.com/office/word/2010/wordprocessingInk" xmlns:wne="http://schemas.microsoft.com/office/word/2006/wordml" xmlns:wps="http://schemas.microsoft.com/office/word/2010/wordprocessingShape" mc:Ignorable="w14 w15 w16se w16cid w16 w16cex w16sdtdh w16sdtfl w16du wp14">
+  <w15:commentEx w15:paraId="14B71199" w15:done="0"/>
+  <w15:commentEx w15:paraId="5BEB1042" w15:paraIdParent="14B71199" w15:done="0"/>
+  <w15:commentEx w15:paraId="464237F2" w15:done="0"/>
   <w15:commentEx w15:paraId="36B4684F" w15:done="0"/>
+  <w15:commentEx w15:paraId="0111A081" w15:done="0"/>
+  <w15:commentEx w15:paraId="0C472352" w15:done="0"/>
   <w15:commentEx w15:paraId="24EA75DF" w15:done="0"/>
+  <w15:commentEx w15:paraId="7A79F92F" w15:done="0"/>
   <w15:commentEx w15:paraId="157F954B" w15:done="0"/>
   <w15:commentEx w15:paraId="1931EF75" w15:done="0"/>
+  <w15:commentEx w15:paraId="2E3817EE" w15:done="0"/>
   <w15:commentEx w15:paraId="100C1654" w15:done="0"/>
   <w15:commentEx w15:paraId="0547DF45" w15:done="0"/>
   <w15:commentEx w15:paraId="373E728B" w15:done="0"/>
@@ -4418,10 +4675,17 @@
 
 <file path=word/commentsExtensible.xml><?xml version="1.0" encoding="utf-8"?>
 <w16cex:commentsExtensible xmlns:wpc="http://schemas.microsoft.com/office/word/2010/wordprocessingCanvas" xmlns:cx="http://schemas.microsoft.com/office/drawing/2014/chartex" xmlns:cx1="http://schemas.microsoft.com/office/drawing/2015/9/8/chartex" xmlns:cx2="http://schemas.microsoft.com/office/drawing/2015/10/21/chartex" xmlns:cx3="http://schemas.microsoft.com/office/drawing/2016/5/9/chartex" xmlns:cx4="http://schemas.microsoft.com/office/drawing/2016/5/10/chartex" xmlns:cx5="http://schemas.microsoft.com/office/drawing/2016/5/11/chartex" xmlns:cx6="http://schemas.microsoft.com/office/drawing/2016/5/12/chartex" xmlns:cx7="http://schemas.microsoft.com/office/drawing/2016/5/13/chartex" xmlns:cx8="http://schemas.microsoft.com/office/drawing/2016/5/14/chartex" xmlns:cr="http://schemas.microsoft.com/office/comments/2020/reactions" xmlns:mc="http://schemas.openxmlformats.org/markup-compatibility/2006" xmlns:aink="http://schemas.microsoft.com/office/drawing/2016/ink" xmlns:am3d="http://schemas.microsoft.com/office/drawing/2017/model3d" xmlns:o="urn:schemas-microsoft-com:office:office" xmlns:oel="http://schemas.microsoft.com/office/2019/extlst" xmlns:r="http://schemas.openxmlformats.org/officeDocument/2006/relationships" xmlns:m="http://schemas.openxmlformats.org/officeDocument/2006/math" xmlns:v="urn:schemas-microsoft-com:vml" xmlns:wp14="http://schemas.microsoft.com/office/word/2010/wordprocessingDrawing" xmlns:wp="http://schemas.openxmlformats.org/drawingml/2006/wordprocessingDrawing" xmlns:w10="urn:schemas-microsoft-com:office:word" xmlns:w="http://schemas.openxmlformats.org/wordprocessingml/2006/main" xmlns:w14="http://schemas.microsoft.com/office/word/2010/wordml" xmlns:w15="http://schemas.microsoft.com/office/word/2012/wordml" xmlns:w16cex="http://schemas.microsoft.com/office/word/2018/wordml/cex" xmlns:w16cid="http://schemas.microsoft.com/office/word/2016/wordml/cid" xmlns:w16="http://schemas.microsoft.com/office/word/2018/wordml" xmlns:w16du="http://schemas.microsoft.com/office/word/2023/wordml/word16du" xmlns:w16sdtdh="http://schemas.microsoft.com/office/word/2020/wordml/sdtdatahash" xmlns:w16sdtfl="http://schemas.microsoft.com/office/word/2024/wordml/sdtformatlock" xmlns:w16se="http://schemas.microsoft.com/office/word/2015/wordml/symex" xmlns:wpg="http://schemas.microsoft.com/office/word/2010/wordprocessingGroup" xmlns:wpi="http://schemas.microsoft.com/office/word/2010/wordprocessingInk" xmlns:wne="http://schemas.microsoft.com/office/word/2006/wordml" xmlns:wps="http://schemas.microsoft.com/office/word/2010/wordprocessingShape" mc:Ignorable="w14 w15 w16se w16cid w16 w16cex w16sdtdh w16sdtfl cr w16du wp14">
+  <w16cex:commentExtensible w16cex:durableId="4C1F4094" w16cex:dateUtc="2026-03-26T18:26:00Z"/>
+  <w16cex:commentExtensible w16cex:durableId="00CB1ABF" w16cex:dateUtc="2026-03-26T20:23:00Z"/>
+  <w16cex:commentExtensible w16cex:durableId="623040B8" w16cex:dateUtc="2026-03-26T18:30:00Z"/>
   <w16cex:commentExtensible w16cex:durableId="638BE91E" w16cex:dateUtc="2026-03-25T18:54:00Z"/>
+  <w16cex:commentExtensible w16cex:durableId="0C3CFD44" w16cex:dateUtc="2026-03-26T18:30:00Z"/>
+  <w16cex:commentExtensible w16cex:durableId="0B720D65" w16cex:dateUtc="2026-03-26T18:30:00Z"/>
   <w16cex:commentExtensible w16cex:durableId="3F947E09" w16cex:dateUtc="2026-03-25T10:06:00Z"/>
+  <w16cex:commentExtensible w16cex:durableId="6FCC506E" w16cex:dateUtc="2026-03-26T18:32:00Z"/>
   <w16cex:commentExtensible w16cex:durableId="334B7370" w16cex:dateUtc="2026-03-25T10:11:00Z"/>
   <w16cex:commentExtensible w16cex:durableId="795CDAC5" w16cex:dateUtc="2026-03-25T10:11:00Z"/>
+  <w16cex:commentExtensible w16cex:durableId="00964716" w16cex:dateUtc="2026-03-26T18:32:00Z"/>
   <w16cex:commentExtensible w16cex:durableId="627D9F31" w16cex:dateUtc="2026-03-25T10:12:00Z"/>
   <w16cex:commentExtensible w16cex:durableId="71DFBF8F" w16cex:dateUtc="2026-03-25T10:13:00Z"/>
   <w16cex:commentExtensible w16cex:durableId="3326769B" w16cex:dateUtc="2026-03-25T10:14:00Z"/>
@@ -4431,10 +4695,17 @@
 
 <file path=word/commentsIds.xml><?xml version="1.0" encoding="utf-8"?>
 <w16cid:commentsIds xmlns:wpc="http://schemas.microsoft.com/office/word/2010/wordprocessingCanvas" xmlns:cx="http://schemas.microsoft.com/office/drawing/2014/chartex" xmlns:cx1="http://schemas.microsoft.com/office/drawing/2015/9/8/chartex" xmlns:cx2="http://schemas.microsoft.com/office/drawing/2015/10/21/chartex" xmlns:cx3="http://schemas.microsoft.com/office/drawing/2016/5/9/chartex" xmlns:cx4="http://schemas.microsoft.com/office/drawing/2016/5/10/chartex" xmlns:cx5="http://schemas.microsoft.com/office/drawing/2016/5/11/chartex" xmlns:cx6="http://schemas.microsoft.com/office/drawing/2016/5/12/chartex" xmlns:cx7="http://schemas.microsoft.com/office/drawing/2016/5/13/chartex" xmlns:cx8="http://schemas.microsoft.com/office/drawing/2016/5/14/chartex" xmlns:mc="http://schemas.openxmlformats.org/markup-compatibility/2006" xmlns:aink="http://schemas.microsoft.com/office/drawing/2016/ink" xmlns:am3d="http://schemas.microsoft.com/office/drawing/2017/model3d" xmlns:o="urn:schemas-microsoft-com:office:office" xmlns:oel="http://schemas.microsoft.com/office/2019/extlst" xmlns:r="http://schemas.openxmlformats.org/officeDocument/2006/relationships" xmlns:m="http://schemas.openxmlformats.org/officeDocument/2006/math" xmlns:v="urn:schemas-microsoft-com:vml" xmlns:wp14="http://schemas.microsoft.com/office/word/2010/wordprocessingDrawing" xmlns:wp="http://schemas.openxmlformats.org/drawingml/2006/wordprocessingDrawing" xmlns:w10="urn:schemas-microsoft-com:office:word" xmlns:w="http://schemas.openxmlformats.org/wordprocessingml/2006/main" xmlns:w14="http://schemas.microsoft.com/office/word/2010/wordml" xmlns:w15="http://schemas.microsoft.com/office/word/2012/wordml" xmlns:w16cex="http://schemas.microsoft.com/office/word/2018/wordml/cex" xmlns:w16cid="http://schemas.microsoft.com/office/word/2016/wordml/cid" xmlns:w16="http://schemas.microsoft.com/office/word/2018/wordml" xmlns:w16du="http://schemas.microsoft.com/office/word/2023/wordml/word16du" xmlns:w16sdtdh="http://schemas.microsoft.com/office/word/2020/wordml/sdtdatahash" xmlns:w16sdtfl="http://schemas.microsoft.com/office/word/2024/wordml/sdtformatlock" xmlns:w16se="http://schemas.microsoft.com/office/word/2015/wordml/symex" xmlns:wpg="http://schemas.microsoft.com/office/word/2010/wordprocessingGroup" xmlns:wpi="http://schemas.microsoft.com/office/word/2010/wordprocessingInk" xmlns:wne="http://schemas.microsoft.com/office/word/2006/wordml" xmlns:wps="http://schemas.microsoft.com/office/word/2010/wordprocessingShape" mc:Ignorable="w14 w15 w16se w16cid w16 w16cex w16sdtdh w16sdtfl w16du wp14">
+  <w16cid:commentId w16cid:paraId="14B71199" w16cid:durableId="4C1F4094"/>
+  <w16cid:commentId w16cid:paraId="5BEB1042" w16cid:durableId="00CB1ABF"/>
+  <w16cid:commentId w16cid:paraId="464237F2" w16cid:durableId="623040B8"/>
   <w16cid:commentId w16cid:paraId="36B4684F" w16cid:durableId="638BE91E"/>
+  <w16cid:commentId w16cid:paraId="0111A081" w16cid:durableId="0C3CFD44"/>
+  <w16cid:commentId w16cid:paraId="0C472352" w16cid:durableId="0B720D65"/>
   <w16cid:commentId w16cid:paraId="24EA75DF" w16cid:durableId="3F947E09"/>
+  <w16cid:commentId w16cid:paraId="7A79F92F" w16cid:durableId="6FCC506E"/>
   <w16cid:commentId w16cid:paraId="157F954B" w16cid:durableId="334B7370"/>
   <w16cid:commentId w16cid:paraId="1931EF75" w16cid:durableId="795CDAC5"/>
+  <w16cid:commentId w16cid:paraId="2E3817EE" w16cid:durableId="00964716"/>
   <w16cid:commentId w16cid:paraId="100C1654" w16cid:durableId="627D9F31"/>
   <w16cid:commentId w16cid:paraId="0547DF45" w16cid:durableId="71DFBF8F"/>
   <w16cid:commentId w16cid:paraId="373E728B" w16cid:durableId="3326769B"/>

</xml_diff>